<commit_message>
docs: remove Finnly from resume, restore DELMAR bullets
Co-Authored-By: Claude Fable 5.1 <noreply@anthropic.com>
Claude-Session: https://claude.ai/code/session_01V4mizCtBkfVKs6zjWmfgYx
</commit_message>
<xml_diff>
--- a/resume/Samantha_Thompson_Resume.docx
+++ b/resume/Samantha_Thompson_Resume.docx
@@ -82,7 +82,7 @@
         <w:pBdr>
           <w:bottom w:val="single" w:color="000000" w:sz="6" w:space="1"/>
         </w:pBdr>
-        <w:spacing w:after="60" w:before="160"/>
+        <w:spacing w:after="80" w:before="200"/>
       </w:pPr>
       <w:r>
         <w:rPr>
@@ -107,7 +107,7 @@
           <w:sz w:val="20"/>
           <w:szCs w:val="20"/>
         </w:rPr>
-        <w:t xml:space="preserve">Founder &amp; Lead Software Engineer, </w:t>
+        <w:t xml:space="preserve">Software Developer II, </w:t>
       </w:r>
       <w:r>
         <w:rPr>
@@ -117,7 +117,7 @@
           <w:sz w:val="20"/>
           <w:szCs w:val="20"/>
         </w:rPr>
-        <w:t xml:space="preserve">Finnly, LLC</w:t>
+        <w:t xml:space="preserve">DELMAR Software Development</w:t>
       </w:r>
       <w:r>
         <w:rPr>
@@ -139,79 +139,115 @@
           <w:sz w:val="20"/>
           <w:szCs w:val="20"/>
         </w:rPr>
-        <w:t xml:space="preserve">November 2025 to Present</w:t>
-      </w:r>
-    </w:p>
-    <w:p>
-      <w:pPr>
-        <w:pStyle w:val="ListParagraph"/>
-        <w:numPr>
-          <w:ilvl w:val="0"/>
-          <w:numId w:val="2"/>
-        </w:numPr>
-        <w:spacing w:after="0"/>
-      </w:pPr>
-      <w:r>
-        <w:rPr>
-          <w:rFonts w:ascii="Lora" w:cs="Lora" w:eastAsia="Lora" w:hAnsi="Lora"/>
-          <w:sz w:val="20"/>
-          <w:szCs w:val="20"/>
-        </w:rPr>
-        <w:t xml:space="preserve">Led product discovery and requirements gathering directly with dog trainers and pet care professionals, translating operational needs into a prioritized roadmap and delivered features</w:t>
-      </w:r>
-    </w:p>
-    <w:p>
-      <w:pPr>
-        <w:pStyle w:val="ListParagraph"/>
-        <w:numPr>
-          <w:ilvl w:val="0"/>
-          <w:numId w:val="2"/>
-        </w:numPr>
-        <w:spacing w:after="0"/>
-      </w:pPr>
-      <w:r>
-        <w:rPr>
-          <w:rFonts w:ascii="Lora" w:cs="Lora" w:eastAsia="Lora" w:hAnsi="Lora"/>
-          <w:sz w:val="20"/>
-          <w:szCs w:val="20"/>
-        </w:rPr>
-        <w:t xml:space="preserve">Architected and developed a multi-tenant SaaS platform using Next.js, enabling pet care businesses to onboard with automated infrastructure provisioning, subscription management, and dedicated application deployment</w:t>
-      </w:r>
-    </w:p>
-    <w:p>
-      <w:pPr>
-        <w:pStyle w:val="ListParagraph"/>
-        <w:numPr>
-          <w:ilvl w:val="0"/>
-          <w:numId w:val="2"/>
-        </w:numPr>
-        <w:spacing w:after="0"/>
-      </w:pPr>
-      <w:r>
-        <w:rPr>
-          <w:rFonts w:ascii="Lora" w:cs="Lora" w:eastAsia="Lora" w:hAnsi="Lora"/>
-          <w:sz w:val="20"/>
-          <w:szCs w:val="20"/>
-        </w:rPr>
-        <w:t xml:space="preserve">Engineered an automated provisioning pipeline integrating Neon PostgreSQL, DigitalOcean, and Resend to dynamically create dedicated databases, cloud instances, and email services for each new customer</w:t>
-      </w:r>
-    </w:p>
-    <w:p>
-      <w:pPr>
-        <w:pStyle w:val="ListParagraph"/>
-        <w:numPr>
-          <w:ilvl w:val="0"/>
-          <w:numId w:val="2"/>
-        </w:numPr>
-        <w:spacing w:after="0"/>
-      </w:pPr>
-      <w:r>
-        <w:rPr>
-          <w:rFonts w:ascii="Lora" w:cs="Lora" w:eastAsia="Lora" w:hAnsi="Lora"/>
-          <w:sz w:val="20"/>
-          <w:szCs w:val="20"/>
-        </w:rPr>
-        <w:t xml:space="preserve">Implemented a Stripe-based subscription and billing system supporting tiered plans, recurring payments, checkout sessions, and a self-service customer billing portal</w:t>
+        <w:t xml:space="preserve">June 2024 to Present</w:t>
+      </w:r>
+    </w:p>
+    <w:p>
+      <w:pPr>
+        <w:pStyle w:val="ListParagraph"/>
+        <w:numPr>
+          <w:ilvl w:val="0"/>
+          <w:numId w:val="2"/>
+        </w:numPr>
+        <w:spacing w:after="0"/>
+      </w:pPr>
+      <w:r>
+        <w:rPr>
+          <w:rFonts w:ascii="Lora" w:cs="Lora" w:eastAsia="Lora" w:hAnsi="Lora"/>
+          <w:sz w:val="20"/>
+          <w:szCs w:val="20"/>
+        </w:rPr>
+        <w:t xml:space="preserve">Served as project manager for multiple client applications by leading developers and communicating project schedules, status updates, and biweekly invoices to clients and stakeholders</w:t>
+      </w:r>
+    </w:p>
+    <w:p>
+      <w:pPr>
+        <w:pStyle w:val="ListParagraph"/>
+        <w:numPr>
+          <w:ilvl w:val="0"/>
+          <w:numId w:val="2"/>
+        </w:numPr>
+        <w:spacing w:after="0"/>
+      </w:pPr>
+      <w:r>
+        <w:rPr>
+          <w:rFonts w:ascii="Lora" w:cs="Lora" w:eastAsia="Lora" w:hAnsi="Lora"/>
+          <w:sz w:val="20"/>
+          <w:szCs w:val="20"/>
+        </w:rPr>
+        <w:t xml:space="preserve">Led software development teams and coordinated production release schedules to ensure seamless deployments, on-time project delivery, and generated over $1.25 million in revenue</w:t>
+      </w:r>
+    </w:p>
+    <w:p>
+      <w:pPr>
+        <w:pStyle w:val="ListParagraph"/>
+        <w:numPr>
+          <w:ilvl w:val="0"/>
+          <w:numId w:val="2"/>
+        </w:numPr>
+        <w:spacing w:after="0"/>
+      </w:pPr>
+      <w:r>
+        <w:rPr>
+          <w:rFonts w:ascii="Lora" w:cs="Lora" w:eastAsia="Lora" w:hAnsi="Lora"/>
+          <w:sz w:val="20"/>
+          <w:szCs w:val="20"/>
+        </w:rPr>
+        <w:t xml:space="preserve">Developed custom REST APIs in .NET 6 to meet client-specific requirements, ensuring scalability, security, and seamless integration with existing systems</w:t>
+      </w:r>
+    </w:p>
+    <w:p>
+      <w:pPr>
+        <w:pStyle w:val="ListParagraph"/>
+        <w:numPr>
+          <w:ilvl w:val="0"/>
+          <w:numId w:val="2"/>
+        </w:numPr>
+        <w:spacing w:after="0"/>
+      </w:pPr>
+      <w:r>
+        <w:rPr>
+          <w:rFonts w:ascii="Lora" w:cs="Lora" w:eastAsia="Lora" w:hAnsi="Lora"/>
+          <w:sz w:val="20"/>
+          <w:szCs w:val="20"/>
+        </w:rPr>
+        <w:t xml:space="preserve">Designed and optimized normalized SQL Server databases to improve data integrity, reduce redundancy, and enhance query performance</w:t>
+      </w:r>
+    </w:p>
+    <w:p>
+      <w:pPr>
+        <w:pStyle w:val="ListParagraph"/>
+        <w:numPr>
+          <w:ilvl w:val="0"/>
+          <w:numId w:val="2"/>
+        </w:numPr>
+        <w:spacing w:after="0"/>
+      </w:pPr>
+      <w:r>
+        <w:rPr>
+          <w:rFonts w:ascii="Lora" w:cs="Lora" w:eastAsia="Lora" w:hAnsi="Lora"/>
+          <w:sz w:val="20"/>
+          <w:szCs w:val="20"/>
+        </w:rPr>
+        <w:t xml:space="preserve">Refactored API endpoints for an agricultural business, reducing average response times by 162%</w:t>
+      </w:r>
+    </w:p>
+    <w:p>
+      <w:pPr>
+        <w:pStyle w:val="ListParagraph"/>
+        <w:numPr>
+          <w:ilvl w:val="0"/>
+          <w:numId w:val="2"/>
+        </w:numPr>
+        <w:spacing w:after="0"/>
+      </w:pPr>
+      <w:r>
+        <w:rPr>
+          <w:rFonts w:ascii="Lora" w:cs="Lora" w:eastAsia="Lora" w:hAnsi="Lora"/>
+          <w:sz w:val="20"/>
+          <w:szCs w:val="20"/>
+        </w:rPr>
+        <w:t xml:space="preserve">Integrated existing client applications with third-party APIs ranging from AI-powered sewer condition assessments to non-profit content management systems</w:t>
       </w:r>
     </w:p>
     <w:p>
@@ -227,7 +263,7 @@
           <w:sz w:val="20"/>
           <w:szCs w:val="20"/>
         </w:rPr>
-        <w:t xml:space="preserve">Software Developer II, </w:t>
+        <w:t xml:space="preserve">Software Developer I, </w:t>
       </w:r>
       <w:r>
         <w:rPr>
@@ -259,144 +295,6 @@
           <w:sz w:val="20"/>
           <w:szCs w:val="20"/>
         </w:rPr>
-        <w:t xml:space="preserve">June 2024 to Present</w:t>
-      </w:r>
-    </w:p>
-    <w:p>
-      <w:pPr>
-        <w:pStyle w:val="ListParagraph"/>
-        <w:numPr>
-          <w:ilvl w:val="0"/>
-          <w:numId w:val="2"/>
-        </w:numPr>
-        <w:spacing w:after="0"/>
-      </w:pPr>
-      <w:r>
-        <w:rPr>
-          <w:rFonts w:ascii="Lora" w:cs="Lora" w:eastAsia="Lora" w:hAnsi="Lora"/>
-          <w:sz w:val="20"/>
-          <w:szCs w:val="20"/>
-        </w:rPr>
-        <w:t xml:space="preserve">Served as project manager for multiple client applications by leading developers and communicating project schedules, status updates, and biweekly invoices to clients and stakeholders</w:t>
-      </w:r>
-    </w:p>
-    <w:p>
-      <w:pPr>
-        <w:pStyle w:val="ListParagraph"/>
-        <w:numPr>
-          <w:ilvl w:val="0"/>
-          <w:numId w:val="2"/>
-        </w:numPr>
-        <w:spacing w:after="0"/>
-      </w:pPr>
-      <w:r>
-        <w:rPr>
-          <w:rFonts w:ascii="Lora" w:cs="Lora" w:eastAsia="Lora" w:hAnsi="Lora"/>
-          <w:sz w:val="20"/>
-          <w:szCs w:val="20"/>
-        </w:rPr>
-        <w:t xml:space="preserve">Led software development teams and coordinated production release schedules to ensure seamless deployments, on-time project delivery, and generated over $1.25 million in revenue</w:t>
-      </w:r>
-    </w:p>
-    <w:p>
-      <w:pPr>
-        <w:pStyle w:val="ListParagraph"/>
-        <w:numPr>
-          <w:ilvl w:val="0"/>
-          <w:numId w:val="2"/>
-        </w:numPr>
-        <w:spacing w:after="0"/>
-      </w:pPr>
-      <w:r>
-        <w:rPr>
-          <w:rFonts w:ascii="Lora" w:cs="Lora" w:eastAsia="Lora" w:hAnsi="Lora"/>
-          <w:sz w:val="20"/>
-          <w:szCs w:val="20"/>
-        </w:rPr>
-        <w:t xml:space="preserve">Developed custom REST APIs in .NET 6 to meet client-specific requirements, ensuring scalability, security, and seamless integration with existing systems</w:t>
-      </w:r>
-    </w:p>
-    <w:p>
-      <w:pPr>
-        <w:pStyle w:val="ListParagraph"/>
-        <w:numPr>
-          <w:ilvl w:val="0"/>
-          <w:numId w:val="2"/>
-        </w:numPr>
-        <w:spacing w:after="0"/>
-      </w:pPr>
-      <w:r>
-        <w:rPr>
-          <w:rFonts w:ascii="Lora" w:cs="Lora" w:eastAsia="Lora" w:hAnsi="Lora"/>
-          <w:sz w:val="20"/>
-          <w:szCs w:val="20"/>
-        </w:rPr>
-        <w:t xml:space="preserve">Designed and optimized normalized SQL Server databases to improve data integrity, reduce redundancy, and enhance query performance</w:t>
-      </w:r>
-    </w:p>
-    <w:p>
-      <w:pPr>
-        <w:pStyle w:val="ListParagraph"/>
-        <w:numPr>
-          <w:ilvl w:val="0"/>
-          <w:numId w:val="2"/>
-        </w:numPr>
-        <w:spacing w:after="0"/>
-      </w:pPr>
-      <w:r>
-        <w:rPr>
-          <w:rFonts w:ascii="Lora" w:cs="Lora" w:eastAsia="Lora" w:hAnsi="Lora"/>
-          <w:sz w:val="20"/>
-          <w:szCs w:val="20"/>
-        </w:rPr>
-        <w:t xml:space="preserve">Refactored API endpoints for an agricultural business, reducing average response times by 162%</w:t>
-      </w:r>
-    </w:p>
-    <w:p>
-      <w:pPr>
-        <w:spacing w:after="20" w:before="100"/>
-        <w:ind w:left="280"/>
-      </w:pPr>
-      <w:r>
-        <w:rPr>
-          <w:rFonts w:ascii="Lora" w:cs="Lora" w:eastAsia="Lora" w:hAnsi="Lora"/>
-          <w:b/>
-          <w:bCs/>
-          <w:sz w:val="20"/>
-          <w:szCs w:val="20"/>
-        </w:rPr>
-        <w:t xml:space="preserve">Software Developer I, </w:t>
-      </w:r>
-      <w:r>
-        <w:rPr>
-          <w:rFonts w:ascii="Lora" w:cs="Lora" w:eastAsia="Lora" w:hAnsi="Lora"/>
-          <w:i/>
-          <w:iCs/>
-          <w:sz w:val="20"/>
-          <w:szCs w:val="20"/>
-        </w:rPr>
-        <w:t xml:space="preserve">DELMAR Software Development</w:t>
-      </w:r>
-      <w:r>
-        <w:rPr>
-          <w:rFonts w:ascii="Lora" w:cs="Lora" w:eastAsia="Lora" w:hAnsi="Lora"/>
-          <w:sz w:val="20"/>
-          <w:szCs w:val="20"/>
-        </w:rPr>
-        <w:t xml:space="preserve"> - West Lafayette, IN</w:t>
-      </w:r>
-    </w:p>
-    <w:p>
-      <w:pPr>
-        <w:spacing w:after="40"/>
-        <w:ind w:left="280"/>
-      </w:pPr>
-      <w:r>
-        <w:rPr>
-          <w:rFonts w:ascii="Lora" w:cs="Lora" w:eastAsia="Lora" w:hAnsi="Lora"/>
-          <w:sz w:val="20"/>
-          <w:szCs w:val="20"/>
-        </w:rPr>
         <w:t xml:space="preserve">January 2022 to June 2024</w:t>
       </w:r>
     </w:p>
@@ -469,7 +367,43 @@
           <w:sz w:val="20"/>
           <w:szCs w:val="20"/>
         </w:rPr>
+        <w:t xml:space="preserve">Diagnosed and resolved a wide range of software bugs in legacy applications, ensuring uninterrupted support for clients and their businesses</w:t>
+      </w:r>
+    </w:p>
+    <w:p>
+      <w:pPr>
+        <w:pStyle w:val="ListParagraph"/>
+        <w:numPr>
+          <w:ilvl w:val="0"/>
+          <w:numId w:val="2"/>
+        </w:numPr>
+        <w:spacing w:after="0"/>
+      </w:pPr>
+      <w:r>
+        <w:rPr>
+          <w:rFonts w:ascii="Lora" w:cs="Lora" w:eastAsia="Lora" w:hAnsi="Lora"/>
+          <w:sz w:val="20"/>
+          <w:szCs w:val="20"/>
+        </w:rPr>
         <w:t xml:space="preserve">Refactored the company's timekeeping software from a Windows Forms app to a single-page web application using Vue and SyncFusion user interface components</w:t>
+      </w:r>
+    </w:p>
+    <w:p>
+      <w:pPr>
+        <w:pStyle w:val="ListParagraph"/>
+        <w:numPr>
+          <w:ilvl w:val="0"/>
+          <w:numId w:val="2"/>
+        </w:numPr>
+        <w:spacing w:after="0"/>
+      </w:pPr>
+      <w:r>
+        <w:rPr>
+          <w:rFonts w:ascii="Lora" w:cs="Lora" w:eastAsia="Lora" w:hAnsi="Lora"/>
+          <w:sz w:val="20"/>
+          <w:szCs w:val="20"/>
+        </w:rPr>
+        <w:t xml:space="preserve">Improved the company's Vue and .NET templates to decrease the amount of development time needed for software creation</w:t>
       </w:r>
     </w:p>
     <w:p>
@@ -477,7 +411,7 @@
         <w:pBdr>
           <w:bottom w:val="single" w:color="000000" w:sz="6" w:space="1"/>
         </w:pBdr>
-        <w:spacing w:after="60" w:before="160"/>
+        <w:spacing w:after="80" w:before="200"/>
       </w:pPr>
       <w:r>
         <w:rPr>
@@ -528,7 +462,25 @@
           <w:sz w:val="20"/>
           <w:szCs w:val="20"/>
         </w:rPr>
-        <w:t xml:space="preserve">Designed and shipped an online multiplayer party game end-to-end with a collaborator, from Figma concept through production deployment, using WebSockets for real-time data exchange</w:t>
+        <w:t xml:space="preserve">Created a custom design for an online multiplayer party game utilizing Figma and the Tailwind CSS library</w:t>
+      </w:r>
+    </w:p>
+    <w:p>
+      <w:pPr>
+        <w:pStyle w:val="ListParagraph"/>
+        <w:numPr>
+          <w:ilvl w:val="0"/>
+          <w:numId w:val="2"/>
+        </w:numPr>
+        <w:spacing w:after="0"/>
+      </w:pPr>
+      <w:r>
+        <w:rPr>
+          <w:rFonts w:ascii="Lora" w:cs="Lora" w:eastAsia="Lora" w:hAnsi="Lora"/>
+          <w:sz w:val="20"/>
+          <w:szCs w:val="20"/>
+        </w:rPr>
+        <w:t xml:space="preserve">Developed a React web application with WebSockets to facilitate real-time data exchange</w:t>
       </w:r>
     </w:p>
     <w:p>
@@ -536,7 +488,7 @@
         <w:pBdr>
           <w:bottom w:val="single" w:color="000000" w:sz="6" w:space="1"/>
         </w:pBdr>
-        <w:spacing w:after="60" w:before="160"/>
+        <w:spacing w:after="80" w:before="200"/>
       </w:pPr>
       <w:r>
         <w:rPr>
@@ -649,7 +601,7 @@
         <w:pBdr>
           <w:bottom w:val="single" w:color="000000" w:sz="6" w:space="1"/>
         </w:pBdr>
-        <w:spacing w:after="60" w:before="160"/>
+        <w:spacing w:after="80" w:before="200"/>
       </w:pPr>
       <w:r>
         <w:rPr>
@@ -768,6 +720,38 @@
           <w:sz w:val="20"/>
           <w:szCs w:val="20"/>
         </w:rPr>
+        <w:t xml:space="preserve">Foundations of Project Management</w:t>
+      </w:r>
+      <w:r>
+        <w:rPr>
+          <w:rFonts w:ascii="Lora" w:cs="Lora" w:eastAsia="Lora" w:hAnsi="Lora"/>
+          <w:sz w:val="20"/>
+          <w:szCs w:val="20"/>
+        </w:rPr>
+        <w:t xml:space="preserve">, Google</w:t>
+      </w:r>
+      <w:r>
+        <w:rPr>
+          <w:rFonts w:ascii="Lora" w:cs="Lora" w:eastAsia="Lora" w:hAnsi="Lora"/>
+          <w:sz w:val="20"/>
+          <w:szCs w:val="20"/>
+        </w:rPr>
+        <w:t xml:space="preserve"> - Issued August 2024</w:t>
+      </w:r>
+    </w:p>
+    <w:p>
+      <w:pPr>
+        <w:spacing w:after="40"/>
+        <w:ind w:left="280"/>
+      </w:pPr>
+      <w:r>
+        <w:rPr>
+          <w:rFonts w:ascii="Lora" w:cs="Lora" w:eastAsia="Lora" w:hAnsi="Lora"/>
+          <w:b/>
+          <w:bCs/>
+          <w:sz w:val="20"/>
+          <w:szCs w:val="20"/>
+        </w:rPr>
         <w:t xml:space="preserve">AWS Certified Cloud Practitioner</w:t>
       </w:r>
       <w:r>
@@ -789,7 +773,7 @@
     </w:p>
     <w:sectPr>
       <w:pgSz w:w="12240" w:h="15840" w:orient="portrait"/>
-      <w:pgMar w:top="380" w:right="520" w:bottom="380" w:left="520" w:header="708" w:footer="708" w:gutter="0"/>
+      <w:pgMar w:top="500" w:right="560" w:bottom="500" w:left="560" w:header="708" w:footer="708" w:gutter="0"/>
       <w:pgNumType/>
       <w:docGrid w:linePitch="360"/>
     </w:sectPr>

</xml_diff>